<commit_message>
Update the test and file counts in the documents to match the code
The documents still claimed 247 tests across 9 modules and 10 migrations;
the tree now has 297 tests across 15 modules and 11 migrations.

Co-Authored-By: Claude Opus 4.8 (1M context) <noreply@anthropic.com>
</commit_message>
<xml_diff>
--- a/deliverables/รายงานโครงงาน.docx
+++ b/deliverables/รายงานโครงงาน.docx
@@ -4680,7 +4680,7 @@
           <w:b w:val="0"/>
           <w:sz w:val="22"/>
         </w:rPr>
-        <w:t>การทดสอบอัตโนมัติเขียนด้วย unittest ของมาตรฐาน Django จำนวน 247 เคส แยกเป็น 9 โมดูลตามหัวข้อ เพื่อให้เห็นชัดว่าแต่ละส่วนถูกตรวจอะไรบ้าง คำสั่งที่ใช้รันคือ</w:t>
+        <w:t>การทดสอบอัตโนมัติเขียนด้วย unittest ของมาตรฐาน Django จำนวน 297 เคส แยกเป็น 15 โมดูลตามหัวข้อ เพื่อให้เห็นชัดว่าแต่ละส่วนถูกตรวจอะไรบ้าง คำสั่งที่ใช้รันคือ</w:t>
       </w:r>
     </w:p>
     <w:p>
@@ -4728,7 +4728,7 @@
           <w:color w:val="0F172A"/>
           <w:sz w:val="19"/>
         </w:rPr>
-        <w:t>Found 247 test(s).</w:t>
+        <w:t>Found 297 test(s).</w:t>
       </w:r>
     </w:p>
     <w:p>
@@ -4743,7 +4743,7 @@
           <w:color w:val="0F172A"/>
           <w:sz w:val="19"/>
         </w:rPr>
-        <w:t>Ran 247 tests in 230.332s</w:t>
+        <w:t>Ran 297 tests in 263.3s</w:t>
       </w:r>
     </w:p>
     <w:p>
@@ -5293,7 +5293,7 @@
                 <w:rFonts w:ascii="Leelawadee UI" w:hAnsi="Leelawadee UI" w:cs="Leelawadee UI" w:eastAsia="Leelawadee UI"/>
                 <w:sz w:val="19"/>
               </w:rPr>
-              <w:t>ผลการรัน: Ran 247 tests — OK</w:t>
+              <w:t>ผลการรัน: Ran 297 tests — OK</w:t>
             </w:r>
           </w:p>
         </w:tc>
@@ -5308,7 +5308,7 @@
                 <w:rFonts w:ascii="Leelawadee UI" w:hAnsi="Leelawadee UI" w:cs="Leelawadee UI" w:eastAsia="Leelawadee UI"/>
                 <w:sz w:val="19"/>
               </w:rPr>
-              <w:t>247</w:t>
+              <w:t>297</w:t>
             </w:r>
           </w:p>
         </w:tc>
@@ -6823,7 +6823,7 @@
                 <w:rFonts w:ascii="Leelawadee UI" w:hAnsi="Leelawadee UI" w:cs="Leelawadee UI" w:eastAsia="Leelawadee UI"/>
                 <w:sz w:val="19"/>
               </w:rPr>
-              <w:t>ชุดทดสอบ 247 เคส 9 โมดูล ผ่านทั้งหมด</w:t>
+              <w:t>ชุดทดสอบ 297 เคส 15 โมดูล ผ่านทั้งหมด</w:t>
             </w:r>
           </w:p>
         </w:tc>
@@ -7126,7 +7126,7 @@
           <w:b w:val="0"/>
           <w:sz w:val="22"/>
         </w:rPr>
-        <w:t>ผลการทดสอบอัตโนมัติผ่านทั้งหมด 247 เคส ไม่มีเคสไหนล้มเหลว ระบบถูกนำขึ้นใช้งานจริงและเปิดให้ทดลองใช้งาน ได้จากอินเทอร์เน็ตที่ https://yumpakjure.onrender.com/</w:t>
+        <w:t>ผลการทดสอบอัตโนมัติผ่านทั้งหมด 297 เคส ไม่มีเคสไหนล้มเหลว ระบบถูกนำขึ้นใช้งานจริงและเปิดให้ทดลองใช้งาน ได้จากอินเทอร์เน็ตที่ https://yumpakjure.onrender.com/</w:t>
       </w:r>
     </w:p>
     <w:p>
@@ -7739,7 +7739,7 @@
                 <w:rFonts w:ascii="Leelawadee UI" w:hAnsi="Leelawadee UI" w:cs="Leelawadee UI" w:eastAsia="Leelawadee UI"/>
                 <w:sz w:val="19"/>
               </w:rPr>
-              <w:t>274 เคส ผ่านทั้งหมด แยกเป็น 9 โมดูล</w:t>
+              <w:t>274 เคส ผ่านทั้งหมด แยกเป็น 15 โมดูล</w:t>
             </w:r>
           </w:p>
         </w:tc>
@@ -8953,7 +8953,7 @@
                 <w:rFonts w:ascii="Leelawadee UI" w:hAnsi="Leelawadee UI" w:cs="Leelawadee UI" w:eastAsia="Leelawadee UI"/>
                 <w:sz w:val="19"/>
               </w:rPr>
-              <w:t>ชุดทดสอบอัตโนมัติ 9 ไฟล์</w:t>
+              <w:t>ชุดทดสอบอัตโนมัติ 15 ไฟล์</w:t>
             </w:r>
           </w:p>
         </w:tc>
@@ -8985,7 +8985,7 @@
                 <w:rFonts w:ascii="Leelawadee UI" w:hAnsi="Leelawadee UI" w:cs="Leelawadee UI" w:eastAsia="Leelawadee UI"/>
                 <w:sz w:val="19"/>
               </w:rPr>
-              <w:t>ไฟล์ migration 10 ไฟล์</w:t>
+              <w:t>ไฟล์ migration 11 ไฟล์</w:t>
             </w:r>
           </w:p>
         </w:tc>

</xml_diff>

<commit_message>
Refresh the submitted documents after the timezone fix
Test count moved to 314 across 17 modules.

Co-Authored-By: Claude Opus 4.8 (1M context) <noreply@anthropic.com>
</commit_message>
<xml_diff>
--- a/deliverables/รายงานโครงงาน.docx
+++ b/deliverables/รายงานโครงงาน.docx
@@ -4680,7 +4680,7 @@
           <w:b w:val="0"/>
           <w:sz w:val="22"/>
         </w:rPr>
-        <w:t>การทดสอบอัตโนมัติเขียนด้วย unittest ของมาตรฐาน Django จำนวน 297 เคส แยกเป็น 15 โมดูลตามหัวข้อ เพื่อให้เห็นชัดว่าแต่ละส่วนถูกตรวจอะไรบ้าง คำสั่งที่ใช้รันคือ</w:t>
+        <w:t>การทดสอบอัตโนมัติเขียนด้วย unittest ของมาตรฐาน Django จำนวน 314 เคส แยกเป็น 17 โมดูลตามหัวข้อ เพื่อให้เห็นชัดว่าแต่ละส่วนถูกตรวจอะไรบ้าง คำสั่งที่ใช้รันคือ</w:t>
       </w:r>
     </w:p>
     <w:p>
@@ -4728,7 +4728,7 @@
           <w:color w:val="0F172A"/>
           <w:sz w:val="19"/>
         </w:rPr>
-        <w:t>Found 297 test(s).</w:t>
+        <w:t>Found 314 test(s).</w:t>
       </w:r>
     </w:p>
     <w:p>
@@ -4743,7 +4743,7 @@
           <w:color w:val="0F172A"/>
           <w:sz w:val="19"/>
         </w:rPr>
-        <w:t>Ran 297 tests in 263.3s</w:t>
+        <w:t>Ran 314 tests in 279.9s</w:t>
       </w:r>
     </w:p>
     <w:p>
@@ -5293,7 +5293,7 @@
                 <w:rFonts w:ascii="Leelawadee UI" w:hAnsi="Leelawadee UI" w:cs="Leelawadee UI" w:eastAsia="Leelawadee UI"/>
                 <w:sz w:val="19"/>
               </w:rPr>
-              <w:t>ผลการรัน: Ran 297 tests — OK</w:t>
+              <w:t>ผลการรัน: Ran 314 tests — OK</w:t>
             </w:r>
           </w:p>
         </w:tc>
@@ -5308,7 +5308,7 @@
                 <w:rFonts w:ascii="Leelawadee UI" w:hAnsi="Leelawadee UI" w:cs="Leelawadee UI" w:eastAsia="Leelawadee UI"/>
                 <w:sz w:val="19"/>
               </w:rPr>
-              <w:t>297</w:t>
+              <w:t>314</w:t>
             </w:r>
           </w:p>
         </w:tc>
@@ -6823,7 +6823,7 @@
                 <w:rFonts w:ascii="Leelawadee UI" w:hAnsi="Leelawadee UI" w:cs="Leelawadee UI" w:eastAsia="Leelawadee UI"/>
                 <w:sz w:val="19"/>
               </w:rPr>
-              <w:t>ชุดทดสอบ 297 เคส 15 โมดูล ผ่านทั้งหมด</w:t>
+              <w:t>ชุดทดสอบ 314 เคส 17 โมดูล ผ่านทั้งหมด</w:t>
             </w:r>
           </w:p>
         </w:tc>
@@ -7126,7 +7126,7 @@
           <w:b w:val="0"/>
           <w:sz w:val="22"/>
         </w:rPr>
-        <w:t>ผลการทดสอบอัตโนมัติผ่านทั้งหมด 297 เคส ไม่มีเคสไหนล้มเหลว ระบบถูกนำขึ้นใช้งานจริงและเปิดให้ทดลองใช้งาน ได้จากอินเทอร์เน็ตที่ https://yumpakjure.onrender.com/</w:t>
+        <w:t>ผลการทดสอบอัตโนมัติผ่านทั้งหมด 314 เคส ไม่มีเคสไหนล้มเหลว ระบบถูกนำขึ้นใช้งานจริงและเปิดให้ทดลองใช้งาน ได้จากอินเทอร์เน็ตที่ https://yumpakjure.onrender.com/</w:t>
       </w:r>
     </w:p>
     <w:p>
@@ -7739,7 +7739,7 @@
                 <w:rFonts w:ascii="Leelawadee UI" w:hAnsi="Leelawadee UI" w:cs="Leelawadee UI" w:eastAsia="Leelawadee UI"/>
                 <w:sz w:val="19"/>
               </w:rPr>
-              <w:t>274 เคส ผ่านทั้งหมด แยกเป็น 15 โมดูล</w:t>
+              <w:t>314 เคส ผ่านทั้งหมด แยกเป็น 17 โมดูล</w:t>
             </w:r>
           </w:p>
         </w:tc>

</xml_diff>

<commit_message>
Update the documents to 329 tests across 19 modules
Co-Authored-By: Claude Opus 4.8 (1M context) <noreply@anthropic.com>
</commit_message>
<xml_diff>
--- a/deliverables/รายงานโครงงาน.docx
+++ b/deliverables/รายงานโครงงาน.docx
@@ -4680,7 +4680,7 @@
           <w:b w:val="0"/>
           <w:sz w:val="22"/>
         </w:rPr>
-        <w:t>การทดสอบอัตโนมัติเขียนด้วย unittest ของมาตรฐาน Django จำนวน 314 เคส แยกเป็น 17 โมดูลตามหัวข้อ เพื่อให้เห็นชัดว่าแต่ละส่วนถูกตรวจอะไรบ้าง คำสั่งที่ใช้รันคือ</w:t>
+        <w:t>การทดสอบอัตโนมัติเขียนด้วย unittest ของมาตรฐาน Django จำนวน 329 เคส แยกเป็น 19 โมดูลตามหัวข้อ เพื่อให้เห็นชัดว่าแต่ละส่วนถูกตรวจอะไรบ้าง คำสั่งที่ใช้รันคือ</w:t>
       </w:r>
     </w:p>
     <w:p>
@@ -4728,7 +4728,7 @@
           <w:color w:val="0F172A"/>
           <w:sz w:val="19"/>
         </w:rPr>
-        <w:t>Found 314 test(s).</w:t>
+        <w:t>Found 329 test(s).</w:t>
       </w:r>
     </w:p>
     <w:p>
@@ -4743,7 +4743,7 @@
           <w:color w:val="0F172A"/>
           <w:sz w:val="19"/>
         </w:rPr>
-        <w:t>Ran 314 tests in 279.9s</w:t>
+        <w:t>Ran 329 tests in 280.9s</w:t>
       </w:r>
     </w:p>
     <w:p>
@@ -5293,7 +5293,7 @@
                 <w:rFonts w:ascii="Leelawadee UI" w:hAnsi="Leelawadee UI" w:cs="Leelawadee UI" w:eastAsia="Leelawadee UI"/>
                 <w:sz w:val="19"/>
               </w:rPr>
-              <w:t>ผลการรัน: Ran 314 tests — OK</w:t>
+              <w:t>ผลการรัน: Ran 329 tests — OK</w:t>
             </w:r>
           </w:p>
         </w:tc>
@@ -5308,7 +5308,7 @@
                 <w:rFonts w:ascii="Leelawadee UI" w:hAnsi="Leelawadee UI" w:cs="Leelawadee UI" w:eastAsia="Leelawadee UI"/>
                 <w:sz w:val="19"/>
               </w:rPr>
-              <w:t>314</w:t>
+              <w:t>329</w:t>
             </w:r>
           </w:p>
         </w:tc>
@@ -6823,7 +6823,7 @@
                 <w:rFonts w:ascii="Leelawadee UI" w:hAnsi="Leelawadee UI" w:cs="Leelawadee UI" w:eastAsia="Leelawadee UI"/>
                 <w:sz w:val="19"/>
               </w:rPr>
-              <w:t>ชุดทดสอบ 314 เคส 17 โมดูล ผ่านทั้งหมด</w:t>
+              <w:t>ชุดทดสอบ 329 เคส 19 โมดูล ผ่านทั้งหมด</w:t>
             </w:r>
           </w:p>
         </w:tc>
@@ -7126,7 +7126,7 @@
           <w:b w:val="0"/>
           <w:sz w:val="22"/>
         </w:rPr>
-        <w:t>ผลการทดสอบอัตโนมัติผ่านทั้งหมด 314 เคส ไม่มีเคสไหนล้มเหลว ระบบถูกนำขึ้นใช้งานจริงและเปิดให้ทดลองใช้งาน ได้จากอินเทอร์เน็ตที่ https://yumpakjure.onrender.com/</w:t>
+        <w:t>ผลการทดสอบอัตโนมัติผ่านทั้งหมด 329 เคส ไม่มีเคสไหนล้มเหลว ระบบถูกนำขึ้นใช้งานจริงและเปิดให้ทดลองใช้งาน ได้จากอินเทอร์เน็ตที่ https://yumpakjure.onrender.com/</w:t>
       </w:r>
     </w:p>
     <w:p>
@@ -7739,7 +7739,7 @@
                 <w:rFonts w:ascii="Leelawadee UI" w:hAnsi="Leelawadee UI" w:cs="Leelawadee UI" w:eastAsia="Leelawadee UI"/>
                 <w:sz w:val="19"/>
               </w:rPr>
-              <w:t>314 เคส ผ่านทั้งหมด แยกเป็น 17 โมดูล</w:t>
+              <w:t>329 เคส ผ่านทั้งหมด แยกเป็น 19 โมดูล</w:t>
             </w:r>
           </w:p>
         </w:tc>
@@ -8889,7 +8889,7 @@
                 <w:rFonts w:ascii="Leelawadee UI" w:hAnsi="Leelawadee UI" w:cs="Leelawadee UI" w:eastAsia="Leelawadee UI"/>
                 <w:sz w:val="19"/>
               </w:rPr>
-              <w:t>เทมเพลตทั้งหมด 15 ไฟล์</w:t>
+              <w:t>เทมเพลตทั้งหมด 16 ไฟล์</w:t>
             </w:r>
           </w:p>
         </w:tc>
@@ -8953,7 +8953,7 @@
                 <w:rFonts w:ascii="Leelawadee UI" w:hAnsi="Leelawadee UI" w:cs="Leelawadee UI" w:eastAsia="Leelawadee UI"/>
                 <w:sz w:val="19"/>
               </w:rPr>
-              <w:t>ชุดทดสอบอัตโนมัติ 15 ไฟล์</w:t>
+              <w:t>ชุดทดสอบอัตโนมัติ 19 ไฟล์</w:t>
             </w:r>
           </w:p>
         </w:tc>

</xml_diff>

<commit_message>
Update the documents to 379 tests across 24 modules
Co-Authored-By: Claude Opus 4.8 (1M context) <noreply@anthropic.com>
</commit_message>
<xml_diff>
--- a/deliverables/รายงานโครงงาน.docx
+++ b/deliverables/รายงานโครงงาน.docx
@@ -4680,7 +4680,7 @@
           <w:b w:val="0"/>
           <w:sz w:val="22"/>
         </w:rPr>
-        <w:t>การทดสอบอัตโนมัติเขียนด้วย unittest ของมาตรฐาน Django จำนวน 329 เคส แยกเป็น 19 โมดูลตามหัวข้อ เพื่อให้เห็นชัดว่าแต่ละส่วนถูกตรวจอะไรบ้าง คำสั่งที่ใช้รันคือ</w:t>
+        <w:t>การทดสอบอัตโนมัติเขียนด้วย unittest ของมาตรฐาน Django จำนวน 379 เคส แยกเป็น 24 โมดูลตามหัวข้อ เพื่อให้เห็นชัดว่าแต่ละส่วนถูกตรวจอะไรบ้าง คำสั่งที่ใช้รันคือ</w:t>
       </w:r>
     </w:p>
     <w:p>
@@ -4728,7 +4728,7 @@
           <w:color w:val="0F172A"/>
           <w:sz w:val="19"/>
         </w:rPr>
-        <w:t>Found 329 test(s).</w:t>
+        <w:t>Found 379 test(s).</w:t>
       </w:r>
     </w:p>
     <w:p>
@@ -4743,7 +4743,7 @@
           <w:color w:val="0F172A"/>
           <w:sz w:val="19"/>
         </w:rPr>
-        <w:t>Ran 329 tests in 280.9s</w:t>
+        <w:t>Ran 379 tests in 358.9s</w:t>
       </w:r>
     </w:p>
     <w:p>
@@ -5293,7 +5293,7 @@
                 <w:rFonts w:ascii="Leelawadee UI" w:hAnsi="Leelawadee UI" w:cs="Leelawadee UI" w:eastAsia="Leelawadee UI"/>
                 <w:sz w:val="19"/>
               </w:rPr>
-              <w:t>ผลการรัน: Ran 329 tests — OK</w:t>
+              <w:t>ผลการรัน: Ran 379 tests — OK</w:t>
             </w:r>
           </w:p>
         </w:tc>
@@ -5308,7 +5308,7 @@
                 <w:rFonts w:ascii="Leelawadee UI" w:hAnsi="Leelawadee UI" w:cs="Leelawadee UI" w:eastAsia="Leelawadee UI"/>
                 <w:sz w:val="19"/>
               </w:rPr>
-              <w:t>329</w:t>
+              <w:t>379</w:t>
             </w:r>
           </w:p>
         </w:tc>
@@ -6823,7 +6823,7 @@
                 <w:rFonts w:ascii="Leelawadee UI" w:hAnsi="Leelawadee UI" w:cs="Leelawadee UI" w:eastAsia="Leelawadee UI"/>
                 <w:sz w:val="19"/>
               </w:rPr>
-              <w:t>ชุดทดสอบ 329 เคส 19 โมดูล ผ่านทั้งหมด</w:t>
+              <w:t>ชุดทดสอบ 379 เคส 24 โมดูล ผ่านทั้งหมด</w:t>
             </w:r>
           </w:p>
         </w:tc>
@@ -7126,7 +7126,7 @@
           <w:b w:val="0"/>
           <w:sz w:val="22"/>
         </w:rPr>
-        <w:t>ผลการทดสอบอัตโนมัติผ่านทั้งหมด 329 เคส ไม่มีเคสไหนล้มเหลว ระบบถูกนำขึ้นใช้งานจริงและเปิดให้ทดลองใช้งาน ได้จากอินเทอร์เน็ตที่ https://yumpakjure.onrender.com/</w:t>
+        <w:t>ผลการทดสอบอัตโนมัติผ่านทั้งหมด 379 เคส ไม่มีเคสไหนล้มเหลว ระบบถูกนำขึ้นใช้งานจริงและเปิดให้ทดลองใช้งาน ได้จากอินเทอร์เน็ตที่ https://yumpakjure.onrender.com/</w:t>
       </w:r>
     </w:p>
     <w:p>
@@ -7739,7 +7739,7 @@
                 <w:rFonts w:ascii="Leelawadee UI" w:hAnsi="Leelawadee UI" w:cs="Leelawadee UI" w:eastAsia="Leelawadee UI"/>
                 <w:sz w:val="19"/>
               </w:rPr>
-              <w:t>329 เคส ผ่านทั้งหมด แยกเป็น 19 โมดูล</w:t>
+              <w:t>379 เคส ผ่านทั้งหมด แยกเป็น 24 โมดูล</w:t>
             </w:r>
           </w:p>
         </w:tc>
@@ -8953,7 +8953,7 @@
                 <w:rFonts w:ascii="Leelawadee UI" w:hAnsi="Leelawadee UI" w:cs="Leelawadee UI" w:eastAsia="Leelawadee UI"/>
                 <w:sz w:val="19"/>
               </w:rPr>
-              <w:t>ชุดทดสอบอัตโนมัติ 19 ไฟล์</w:t>
+              <w:t>ชุดทดสอบอัตโนมัติ 24 ไฟล์</w:t>
             </w:r>
           </w:p>
         </w:tc>

</xml_diff>

<commit_message>
Refresh documents to 386 tests across 25 modules
</commit_message>
<xml_diff>
--- a/deliverables/รายงานโครงงาน.docx
+++ b/deliverables/รายงานโครงงาน.docx
@@ -4680,7 +4680,7 @@
           <w:b w:val="0"/>
           <w:sz w:val="22"/>
         </w:rPr>
-        <w:t>การทดสอบอัตโนมัติเขียนด้วย unittest ของมาตรฐาน Django จำนวน 379 เคส แยกเป็น 24 โมดูลตามหัวข้อ เพื่อให้เห็นชัดว่าแต่ละส่วนถูกตรวจอะไรบ้าง คำสั่งที่ใช้รันคือ</w:t>
+        <w:t>การทดสอบอัตโนมัติเขียนด้วย unittest ของมาตรฐาน Django จำนวน 386 เคส แยกเป็น 25 โมดูลตามหัวข้อ เพื่อให้เห็นชัดว่าแต่ละส่วนถูกตรวจอะไรบ้าง คำสั่งที่ใช้รันคือ</w:t>
       </w:r>
     </w:p>
     <w:p>
@@ -4728,7 +4728,7 @@
           <w:color w:val="0F172A"/>
           <w:sz w:val="19"/>
         </w:rPr>
-        <w:t>Found 379 test(s).</w:t>
+        <w:t>Found 386 test(s).</w:t>
       </w:r>
     </w:p>
     <w:p>
@@ -4743,7 +4743,7 @@
           <w:color w:val="0F172A"/>
           <w:sz w:val="19"/>
         </w:rPr>
-        <w:t>Ran 379 tests in 358.9s</w:t>
+        <w:t>Ran 386 tests in 406.5s</w:t>
       </w:r>
     </w:p>
     <w:p>
@@ -5293,7 +5293,7 @@
                 <w:rFonts w:ascii="Leelawadee UI" w:hAnsi="Leelawadee UI" w:cs="Leelawadee UI" w:eastAsia="Leelawadee UI"/>
                 <w:sz w:val="19"/>
               </w:rPr>
-              <w:t>ผลการรัน: Ran 379 tests — OK</w:t>
+              <w:t>ผลการรัน: Ran 386 tests — OK</w:t>
             </w:r>
           </w:p>
         </w:tc>
@@ -5308,7 +5308,7 @@
                 <w:rFonts w:ascii="Leelawadee UI" w:hAnsi="Leelawadee UI" w:cs="Leelawadee UI" w:eastAsia="Leelawadee UI"/>
                 <w:sz w:val="19"/>
               </w:rPr>
-              <w:t>379</w:t>
+              <w:t>386</w:t>
             </w:r>
           </w:p>
         </w:tc>
@@ -6823,7 +6823,7 @@
                 <w:rFonts w:ascii="Leelawadee UI" w:hAnsi="Leelawadee UI" w:cs="Leelawadee UI" w:eastAsia="Leelawadee UI"/>
                 <w:sz w:val="19"/>
               </w:rPr>
-              <w:t>ชุดทดสอบ 379 เคส 24 โมดูล ผ่านทั้งหมด</w:t>
+              <w:t>ชุดทดสอบ 386 เคส 25 โมดูล ผ่านทั้งหมด</w:t>
             </w:r>
           </w:p>
         </w:tc>
@@ -7126,7 +7126,7 @@
           <w:b w:val="0"/>
           <w:sz w:val="22"/>
         </w:rPr>
-        <w:t>ผลการทดสอบอัตโนมัติผ่านทั้งหมด 379 เคส ไม่มีเคสไหนล้มเหลว ระบบถูกนำขึ้นใช้งานจริงและเปิดให้ทดลองใช้งาน ได้จากอินเทอร์เน็ตที่ https://yumpakjure.onrender.com/</w:t>
+        <w:t>ผลการทดสอบอัตโนมัติผ่านทั้งหมด 386 เคส ไม่มีเคสไหนล้มเหลว ระบบถูกนำขึ้นใช้งานจริงและเปิดให้ทดลองใช้งาน ได้จากอินเทอร์เน็ตที่ https://yumpakjure.onrender.com/</w:t>
       </w:r>
     </w:p>
     <w:p>
@@ -7739,7 +7739,7 @@
                 <w:rFonts w:ascii="Leelawadee UI" w:hAnsi="Leelawadee UI" w:cs="Leelawadee UI" w:eastAsia="Leelawadee UI"/>
                 <w:sz w:val="19"/>
               </w:rPr>
-              <w:t>379 เคส ผ่านทั้งหมด แยกเป็น 24 โมดูล</w:t>
+              <w:t>386 เคส ผ่านทั้งหมด แยกเป็น 25 โมดูล</w:t>
             </w:r>
           </w:p>
         </w:tc>
@@ -8953,7 +8953,7 @@
                 <w:rFonts w:ascii="Leelawadee UI" w:hAnsi="Leelawadee UI" w:cs="Leelawadee UI" w:eastAsia="Leelawadee UI"/>
                 <w:sz w:val="19"/>
               </w:rPr>
-              <w:t>ชุดทดสอบอัตโนมัติ 24 ไฟล์</w:t>
+              <w:t>ชุดทดสอบอัตโนมัติ 25 ไฟล์</w:t>
             </w:r>
           </w:p>
         </w:tc>

</xml_diff>

<commit_message>
Update documents to match production: Neon, SECRET_KEY env, PDF export
</commit_message>
<xml_diff>
--- a/deliverables/รายงานโครงงาน.docx
+++ b/deliverables/รายงานโครงงาน.docx
@@ -1171,7 +1171,7 @@
           <w:b w:val="0"/>
           <w:sz w:val="22"/>
         </w:rPr>
-        <w:t>ระบบแบ่งเป็น 4 ชั้น ได้แก่ ชั้นนำเสนอ (Template) ที่สร้างหน้า HTML ด้วย Tailwind CSS ชั้นตรรกะ (View) ที่ประมวลผลคำขอและส่งข้อมูลกลับ ชั้นโมเดล (Model) ที่กำหนดโครงสร้างข้อมูลและชุดฟอร์ม และชั้นฐานข้อมูลที่เป็น SQLite เมื่อมีการตั้งค่า DATABASE_URL ระบบจะสลับไปใช้ฐานข้อมูลภายนอก ผ่านแพ็กเกจ dj-database-url โดยอัตโนมัติ</w:t>
+        <w:t>ระบบแบ่งเป็น 4 ชั้น ได้แก่ ชั้นนำเสนอ (Template) ที่สร้างหน้า HTML ด้วย Tailwind CSS ชั้นตรรกะ (View) ที่ประมวลผลคำขอและส่งข้อมูลกลับ ชั้นโมเดล (Model) ที่กำหนดโครงสร้างข้อมูลและชุดฟอร์ม และชั้นฐานข้อมูลที่เป็น PostgreSQL (Neon) ในการใช้งานจริงผ่าน DATABASE_URL โดยสลับอัตโนมัติผ่านแพ็กเกจ dj-database-url ส่วนในเครื่องพัฒนาใช้ SQLite</w:t>
       </w:r>
     </w:p>
     <w:p>
@@ -1710,7 +1710,7 @@
                 <w:rFonts w:ascii="Leelawadee UI" w:hAnsi="Leelawadee UI" w:cs="Leelawadee UI" w:eastAsia="Leelawadee UI"/>
                 <w:sz w:val="19"/>
               </w:rPr>
-              <w:t>SQLite (db.sqlite3) และสลับไปใช้ฐานข้อมูลภายนอกเมื่อตั้ง DATABASE_URL</w:t>
+              <w:t>PostgreSQL (Neon) ในการใช้งานจริงผ่าน DATABASE_URL และ SQLite (db.sqlite3) สำหรับพัฒนาในเครื่อง</w:t>
             </w:r>
           </w:p>
         </w:tc>
@@ -1870,7 +1870,7 @@
                 <w:rFonts w:ascii="Leelawadee UI" w:hAnsi="Leelawadee UI" w:cs="Leelawadee UI" w:eastAsia="Leelawadee UI"/>
                 <w:sz w:val="19"/>
               </w:rPr>
-              <w:t>Git (242 คอมมิต)</w:t>
+              <w:t>Git (270 คอมมิต)</w:t>
             </w:r>
           </w:p>
         </w:tc>
@@ -3475,7 +3475,7 @@
           <w:b w:val="0"/>
           <w:sz w:val="22"/>
         </w:rPr>
-        <w:t>หน้าแดชบอร์ดมีปุ่มส่งออกข้อมูล 2 ปุ่มที่ใช้งานได้จริง ได้แก่ /export/playlists/csv/ ที่ส่งออกรายการเพลย์ลิสต์ และ /export/queue/csv/ ที่ส่งออกคิวเพลง ทั้งสองเส้นทางอยู่ภายใต้มัฤติศาสตร์ role_required และคืนไฟล์ชนิด text/csv ให้ดาวน์โหลดทันที ส่วนปุ่มส่งออกเป็น PDF ที่ปรากฏอยู่ในหน้าแดชบอร์ดยังไม่ได้เชื่อมต่อ กับโค้ดจัดการ จึงยังใช้งานไม่ได้ ซึ่งระบุไว้ในข้อจำกัดของบทที่ 6</w:t>
+        <w:t>หน้าแดชบอร์ดมีปุ่มส่งออกข้อมูล 2 ปุ่มที่ใช้งานได้จริง ได้แก่ /export/playlists/csv/ ที่ส่งออกรายการเพลย์ลิสต์ และ /export/queue/csv/ ที่ส่งออกคิวเพลง ทั้งสองเส้นทางอยู่ภายใต้มัฤติศาสตร์ role_required และคืนไฟล์ชนิด text/csv ให้ดาวน์โหลดทันที ส่วนปุ่มส่งออกแดชบอร์ดเป็น PDF เชื่อมต่อแล้ว โดยเรียก window.print() ให้ผู้ใช้บันทึกเป็น PDF จากเบราว์เซอร์</w:t>
       </w:r>
     </w:p>
     <w:p>
@@ -5343,7 +5343,7 @@
           <w:b w:val="0"/>
           <w:sz w:val="22"/>
         </w:rPr>
-        <w:t>•  tests.py จำนวน 156 เคส ครอบคลุมเส้นทางหลักทั้งหมด ทั้งหน้าเว็บ การขอเพลง การจัดการคิว การค้นหา และเพลย์ลิสต์ รวมถึงกรณีผิดปกติ เช่น ส่ง JSON ไม่ถูกต้อง หรือไม่มีสิทธิ์เข้าถึง</w:t>
+        <w:t>•  tests.py จำนวน 157 เคส ครอบคลุมเส้นทางหลักทั้งหมด ทั้งหน้าเว็บ การขอเพลง การจัดการคิว การค้นหา และเพลย์ลิสต์ รวมถึงกรณีผิดปกติ เช่น ส่ง JSON ไม่ถูกต้อง หรือไม่มีสิทธิ์เข้าถึง</w:t>
       </w:r>
     </w:p>
     <w:p>
@@ -6949,7 +6949,7 @@
                 <w:rFonts w:ascii="Leelawadee UI" w:hAnsi="Leelawadee UI" w:cs="Leelawadee UI" w:eastAsia="Leelawadee UI"/>
                 <w:sz w:val="19"/>
               </w:rPr>
-              <w:t>บางส่วน</w:t>
+              <w:t>มี</w:t>
             </w:r>
           </w:p>
         </w:tc>
@@ -6964,7 +6964,7 @@
                 <w:rFonts w:ascii="Leelawadee UI" w:hAnsi="Leelawadee UI" w:cs="Leelawadee UI" w:eastAsia="Leelawadee UI"/>
                 <w:sz w:val="19"/>
               </w:rPr>
-              <w:t>ส่งออกเพลย์ลิสต์และคิวเพลงเป็น CSV ได้จริง ส่วนปุ่มส่งออก PDF ยังไม่ได้เชื่อมต่อ</w:t>
+              <w:t>ส่งออกเพลย์ลิสต์และคิวเพลงเป็น CSV ได้จริง และปุ่มส่งออกแดชบอร์ดเป็น PDF เชื่อมต่อแล้วผ่าน window.print()</w:t>
             </w:r>
           </w:p>
         </w:tc>
@@ -7230,7 +7230,7 @@
                 <w:rFonts w:ascii="Leelawadee UI" w:hAnsi="Leelawadee UI" w:cs="Leelawadee UI" w:eastAsia="Leelawadee UI"/>
                 <w:sz w:val="19"/>
               </w:rPr>
-              <w:t>ฐานข้อมูลบน Render เป็น SQLite บนดิสก์ชั่วคราว</w:t>
+              <w:t>ฐานข้อมูลการใช้งานจริงย้ายไป PostgreSQL (Neon) แล้ว</w:t>
             </w:r>
           </w:p>
         </w:tc>
@@ -7245,7 +7245,7 @@
                 <w:rFonts w:ascii="Leelawadee UI" w:hAnsi="Leelawadee UI" w:cs="Leelawadee UI" w:eastAsia="Leelawadee UI"/>
                 <w:sz w:val="19"/>
               </w:rPr>
-              <w:t>ทุกครั้งที่ deploy ใหม่ ฐานข้อมูลจะถูกลบและสร้างขึ้นใหม่ ข้อมูลที่ลูกค้าขอเพลงไว้จะหาย คำสั่ง ensure_admin และตัวเลือก --with-demo เป็นเพียงการสร้างบัญชีและข้อมูลตัวอย่างขึ้นใหม่ ทุกครั้งที่เริ่มระบบ ไม่ใช่การเก็บข้อมูลถาวร</w:t>
+              <w:t>เดิมระบบบน Render ใช้ SQLite บนดิสก์ชั่วคราว ข้อมูลจึงหายทุกครั้งที่ deploy ใหม่ ปัจจุบันตั้งค่า DATABASE_URL ชี้ไปยัง Neon Postgres แล้ว ข้อมูลจึงคงอยู่ข้ามการ deploy ส่วน SQLite (db.sqlite3) ยังใช้สำหรับการพัฒนาในเครื่องเท่านั้น</w:t>
             </w:r>
           </w:p>
         </w:tc>
@@ -7260,7 +7260,7 @@
                 <w:rFonts w:ascii="Leelawadee UI" w:hAnsi="Leelawadee UI" w:cs="Leelawadee UI" w:eastAsia="Leelawadee UI"/>
                 <w:sz w:val="19"/>
               </w:rPr>
-              <w:t>ใช้ฐานข้อมูลภายนอก เช่น PostgreSQL ของ Render หรือ Neon โดยตั้งค่า DATABASE_URL</w:t>
+              <w:t>ไม่ต้องทำเพิ่มในส่วนนี้ — เหลือเพียงย้ายไฟล์อัปโหลดไปพื้นที่เก็บไฟล์ภายนอก</w:t>
             </w:r>
           </w:p>
         </w:tc>
@@ -7277,7 +7277,7 @@
                 <w:rFonts w:ascii="Leelawadee UI" w:hAnsi="Leelawadee UI" w:cs="Leelawadee UI" w:eastAsia="Leelawadee UI"/>
                 <w:sz w:val="19"/>
               </w:rPr>
-              <w:t>SECRET_KEY เป็นค่าสำรองที่อยู่ในซอร์สโค้ด</w:t>
+              <w:t>SECRET_KEY ของการใช้งานจริงตั้งเป็นตัวแปรสภาพแวดล้อมแล้ว</w:t>
             </w:r>
           </w:p>
         </w:tc>
@@ -7292,7 +7292,7 @@
                 <w:rFonts w:ascii="Leelawadee UI" w:hAnsi="Leelawadee UI" w:cs="Leelawadee UI" w:eastAsia="Leelawadee UI"/>
                 <w:sz w:val="19"/>
               </w:rPr>
-              <w:t>ถ้าไม่ได้ตั้ง SECRET_KEY ในตัวแปรสภาพแวดล้อม ระบบจะยังทำงานต่อ แต่จะเซ็น session และโทเคน CSRF ด้วยค่าที่เป็นสาธารณะ โค้ดจะออกคำเตือนชัดเจนเมื่อพบกรณีนี้</w:t>
+              <w:t>ในซอร์สโค้ดยังมีค่าสำรองไว้สำหรับพัฒนาในเครื่อง แต่บน Render ตั้ง SECRET_KEY เป็นสตริงสุ่มในตัวแปรสภาพแวดล้อมแล้ว โค้ดจะออกคำเตือนชัดเจนถ้าพบค่าสำรองในการใช้งานจริง</w:t>
             </w:r>
           </w:p>
         </w:tc>
@@ -7307,7 +7307,7 @@
                 <w:rFonts w:ascii="Leelawadee UI" w:hAnsi="Leelawadee UI" w:cs="Leelawadee UI" w:eastAsia="Leelawadee UI"/>
                 <w:sz w:val="19"/>
               </w:rPr>
-              <w:t>ตั้งค่า SECRET_KEY เป็นสตริงสุ่มในตัวแปรสภาพแวดล้อมของ Render</w:t>
+              <w:t>ไม่ต้องทำเพิ่มในส่วนนี้ — คงไว้เพียงคำเตือนในโค้ด</w:t>
             </w:r>
           </w:p>
         </w:tc>
@@ -7418,7 +7418,7 @@
                 <w:rFonts w:ascii="Leelawadee UI" w:hAnsi="Leelawadee UI" w:cs="Leelawadee UI" w:eastAsia="Leelawadee UI"/>
                 <w:sz w:val="19"/>
               </w:rPr>
-              <w:t>ปุ่มส่งออกแดนชอนราย (PDF) บนแดชบอร์ดยังไม่ได้เชื่อมต่อ</w:t>
+              <w:t>ปุ่มส่งออกแดชบอร์ด (PDF) เชื่อมต่อแล้ว</w:t>
             </w:r>
           </w:p>
         </w:tc>
@@ -7433,7 +7433,7 @@
                 <w:rFonts w:ascii="Leelawadee UI" w:hAnsi="Leelawadee UI" w:cs="Leelawadee UI" w:eastAsia="Leelawadee UI"/>
                 <w:sz w:val="19"/>
               </w:rPr>
-              <w:t>ปุ่มปรากฏอยู่ในหน้าแดชบอร์ด แต่ยังไม่มีโค้ดจัดการการกด จึงยังส่งออกไฟล์ PDF ไม่ได้ ส่วนการส่งออก CSV สองรายการใช้งานได้จริงที่ /export/playlists/csv/ และ /export/queue/csv/</w:t>
+              <w:t>ปุ่ม exportDashboardPdf บนแดชบอร์ดเรียก window.print() ให้ผู้ใช้เลือกบันทึกเป็น PDF ได้จากหน้าต่างพิมพ์ของเบราว์เซอร์ ส่วนการส่งออก CSV สองรายการใช้งานได้จริงที่ /export/playlists/csv/ และ /export/queue/csv/</w:t>
             </w:r>
           </w:p>
         </w:tc>
@@ -7448,7 +7448,7 @@
                 <w:rFonts w:ascii="Leelawadee UI" w:hAnsi="Leelawadee UI" w:cs="Leelawadee UI" w:eastAsia="Leelawadee UI"/>
                 <w:sz w:val="19"/>
               </w:rPr>
-              <w:t>เขียน view ที่สร้าง PDF แล้วผูกกับ id ของปุ่มนั้น</w:t>
+              <w:t>ไม่ต้องทำเพิ่มในส่วนนี้</w:t>
             </w:r>
           </w:p>
         </w:tc>
@@ -7483,33 +7483,7 @@
           <w:b w:val="0"/>
           <w:sz w:val="22"/>
         </w:rPr>
-        <w:t>•  ย้ายฐานข้อมูลไปใช้ PostgreSQL และย้ายไฟล์ที่อัปโหลดไปยังพื้นที่เก็บไฟล์ภายนอก เพื่อให้ข้อมูลและรูปภาพอยู่คงถาวรข้ามการ deploy</w:t>
-      </w:r>
-    </w:p>
-    <w:p>
-      <w:pPr>
-        <w:spacing w:after="60"/>
-      </w:pPr>
-      <w:r>
-        <w:rPr>
-          <w:rFonts w:ascii="Leelawadee UI" w:hAnsi="Leelawadee UI" w:cs="Leelawadee UI" w:eastAsia="Leelawadee UI"/>
-          <w:b w:val="0"/>
-          <w:sz w:val="22"/>
-        </w:rPr>
-        <w:t>•  ตั้งค่า SECRET_KEY และ DATABASE_URL เป็นตัวแปรสภาพแวดล้อมในระบบใช้งานจริง</w:t>
-      </w:r>
-    </w:p>
-    <w:p>
-      <w:pPr>
-        <w:spacing w:after="60"/>
-      </w:pPr>
-      <w:r>
-        <w:rPr>
-          <w:rFonts w:ascii="Leelawadee UI" w:hAnsi="Leelawadee UI" w:cs="Leelawadee UI" w:eastAsia="Leelawadee UI"/>
-          <w:b w:val="0"/>
-          <w:sz w:val="22"/>
-        </w:rPr>
-        <w:t>•  เชื่อมปุ่มส่งออกแดนชอนรายเป็น PDF ให้ใช้งานได้จริง</w:t>
+        <w:t>•  ย้ายไฟล์ที่อัปโหลดไปยังพื้นที่เก็บไฟล์ภายนอก เช่น S3 หรือ Cloudinary เพื่อให้รูปภาพอยู่คงถาวรข้ามการ deploy (ส่วนฐานข้อมูลย้ายไป PostgreSQL แล้ว SECRET_KEY กับ DATABASE_URL ตั้งเป็นตัวแปรสภาพแวดล้อมแล้ว และปุ่มส่งออก PDF เชื่อมต่อแล้ว)</w:t>
       </w:r>
     </w:p>
     <w:p>

</xml_diff>

<commit_message>
Fix garbled word to decorator in documents
</commit_message>
<xml_diff>
--- a/deliverables/รายงานโครงงาน.docx
+++ b/deliverables/รายงานโครงงาน.docx
@@ -417,7 +417,7 @@
           <w:b w:val="0"/>
           <w:sz w:val="22"/>
         </w:rPr>
-        <w:t>ระบบกำหนดผู้ใช้ 3 บทบาท เก็บไว้ในฟิลด์ role ของโมเดล Profile ได้แก่ admin, staff และ customer การควบคุมสิทธิ์ทำงานด้วยมัฤติศาสตร์ role_required ในไฟล์ music/views_auth.py ซึ่งจะตรวจว่าผู้ใช้ เข้าสู่ระบบแล้วหรือยัง และบทบาทอยู่ในรายการที่อนุญาตหรือไม่ หากไม่ผ่านจะแจ้งข้อความและพากลับไปหน้าเครื่องเล่น ทันที ไม่ใช่แค่ซ่อนปุ่มในหน้าเว็บ</w:t>
+        <w:t>ระบบกำหนดผู้ใช้ 3 บทบาท เก็บไว้ในฟิลด์ role ของโมเดล Profile ได้แก่ admin, staff และ customer การควบคุมสิทธิ์ทำงานด้วยเดคคอเรเตอร์ role_required ในไฟล์ music/views_auth.py ซึ่งจะตรวจว่าผู้ใช้ เข้าสู่ระบบแล้วหรือยัง และบทบาทอยู่ในรายการที่อนุญาตหรือไม่ หากไม่ผ่านจะแจ้งข้อความและพากลับไปหน้าเครื่องเล่น ทันที ไม่ใช่แค่ซ่อนปุ่มในหน้าเว็บ</w:t>
       </w:r>
     </w:p>
     <w:tbl>
@@ -639,7 +639,7 @@
           <w:b w:val="0"/>
           <w:sz w:val="22"/>
         </w:rPr>
-        <w:t>การตรวจสิทธิ์ซ้ำที่ฝั่งเซิร์ฟเวอร์เป็นสิ่งสำคัญ เพราะการซ่อนปุ่มด้วย HTML หรือ JavaScript ป้องกันได้แค่ระดับหน้าตา ผู้ใช้ที่เข้าถึง URL โดยตรงยังต้องผ่านการตรวจจากมัฤติศาสตร์นี้ ชุดทดสอบ tests_nav_customer.py มีกรณีตรวจสอบว่าบทบาท customer เปิด /management/users/ ไม่ได้จริง</w:t>
+        <w:t>การตรวจสิทธิ์ซ้ำที่ฝั่งเซิร์ฟเวอร์เป็นสิ่งสำคัญ เพราะการซ่อนปุ่มด้วย HTML หรือ JavaScript ป้องกันได้แค่ระดับหน้าตา ผู้ใช้ที่เข้าถึง URL โดยตรงยังต้องผ่านการตรวจจากเดคคอเรเตอร์นี้ ชุดทดสอบ tests_nav_customer.py มีกรณีตรวจสอบว่าบทบาท customer เปิด /management/users/ ไม่ได้จริง</w:t>
       </w:r>
     </w:p>
     <w:p>
@@ -995,7 +995,7 @@
                 <w:rFonts w:ascii="Leelawadee UI" w:hAnsi="Leelawadee UI" w:cs="Leelawadee UI" w:eastAsia="Leelawadee UI"/>
                 <w:sz w:val="19"/>
               </w:rPr>
-              <w:t>ย้ายลำดับเพลง ลบเพลง หรือล้างคิวทั้งหมดผ่านมัฤติศาสตร์ role_required</w:t>
+              <w:t>ย้ายลำดับเพลง ลบเพลง หรือล้างคิวทั้งหมดผ่านเดคคอเรเตอร์ role_required</w:t>
             </w:r>
           </w:p>
         </w:tc>
@@ -2659,7 +2659,7 @@
           <w:b w:val="0"/>
           <w:sz w:val="22"/>
         </w:rPr>
-        <w:t>มัฤติศาสตร์นี้ถูกใช้กับวิวจัดการผู้ใช้ แนวเพลง แท็ก แดชบอร์ด และการส่งออกข้อมูล ทำให้ผู้ที่ไม่มีสิทธิ์เข้าถึงไม่ได้แม้จะพิมพ์ URL โดยตรง และไม่ได้พึ่งการซ่อนเมนูเพียงอย่างเดียว</w:t>
+        <w:t>เดคคอเรเตอร์นี้ถูกใช้กับวิวจัดการผู้ใช้ แนวเพลง แท็ก แดชบอร์ด และการส่งออกข้อมูล ทำให้ผู้ที่ไม่มีสิทธิ์เข้าถึงไม่ได้แม้จะพิมพ์ URL โดยตรง และไม่ได้พึ่งการซ่อนเมนูเพียงอย่างเดียว</w:t>
       </w:r>
     </w:p>
     <w:p>
@@ -2686,7 +2686,7 @@
           <w:b w:val="0"/>
           <w:sz w:val="22"/>
         </w:rPr>
-        <w:t>ระบบทำ CRUD ได้ 5 กลุ่ม ได้แก่ ผู้ใช้ แนวเพลง แท็ก เพลย์ลิสต์ และคิวเพลง ทุกกลุ่มใช้ฟอร์มของ Django ร่วมกับมัฤติศาสตร์ role_required ทุกการแก้ไขมีการตรวจสอบความถูกต้องก่อนบันทึก และแสดงข้อความแจ้งเตือน ผ่านระบบ messages ของ Django เมื่อบันทึกสำเร็จหรือไม่สำเร็จ</w:t>
+        <w:t>ระบบทำ CRUD ได้ 5 กลุ่ม ได้แก่ ผู้ใช้ แนวเพลง แท็ก เพลย์ลิสต์ และคิวเพลง ทุกกลุ่มใช้ฟอร์มของ Django ร่วมกับเดคคอเรเตอร์ role_required ทุกการแก้ไขมีการตรวจสอบความถูกต้องก่อนบันทึก และแสดงข้อความแจ้งเตือน ผ่านระบบ messages ของ Django เมื่อบันทึกสำเร็จหรือไม่สำเร็จ</w:t>
       </w:r>
     </w:p>
     <w:p>
@@ -3475,7 +3475,7 @@
           <w:b w:val="0"/>
           <w:sz w:val="22"/>
         </w:rPr>
-        <w:t>หน้าแดชบอร์ดมีปุ่มส่งออกข้อมูล 2 ปุ่มที่ใช้งานได้จริง ได้แก่ /export/playlists/csv/ ที่ส่งออกรายการเพลย์ลิสต์ และ /export/queue/csv/ ที่ส่งออกคิวเพลง ทั้งสองเส้นทางอยู่ภายใต้มัฤติศาสตร์ role_required และคืนไฟล์ชนิด text/csv ให้ดาวน์โหลดทันที ส่วนปุ่มส่งออกแดชบอร์ดเป็น PDF เชื่อมต่อแล้ว โดยเรียก window.print() ให้ผู้ใช้บันทึกเป็น PDF จากเบราว์เซอร์</w:t>
+        <w:t>หน้าแดชบอร์ดมีปุ่มส่งออกข้อมูล 2 ปุ่มที่ใช้งานได้จริง ได้แก่ /export/playlists/csv/ ที่ส่งออกรายการเพลย์ลิสต์ และ /export/queue/csv/ ที่ส่งออกคิวเพลง ทั้งสองเส้นทางอยู่ภายใต้เดคคอเรเตอร์ role_required และคืนไฟล์ชนิด text/csv ให้ดาวน์โหลดทันที ส่วนปุ่มส่งออกแดชบอร์ดเป็น PDF เชื่อมต่อแล้ว โดยเรียก window.print() ให้ผู้ใช้บันทึกเป็น PDF จากเบราว์เซอร์</w:t>
       </w:r>
     </w:p>
     <w:p>
@@ -8735,7 +8735,7 @@
                 <w:rFonts w:ascii="Leelawadee UI" w:hAnsi="Leelawadee UI" w:cs="Leelawadee UI" w:eastAsia="Leelawadee UI"/>
                 <w:sz w:val="19"/>
               </w:rPr>
-              <w:t>สมัครสมาชิก เข้าสู่ระบบ โปรไฟล์ แดชบอร์ด การจัดการผู้ใช้ แนวเพลง แท็ก และมัฤติศาสตร์ role_required</w:t>
+              <w:t>สมัครสมาชิก เข้าสู่ระบบ โปรไฟล์ แดชบอร์ด การจัดการผู้ใช้ แนวเพลง แท็ก และเดคคอเรเตอร์ role_required</w:t>
             </w:r>
           </w:p>
         </w:tc>

</xml_diff>